<commit_message>
Refactor infrastructure and enhance LLM integration
- Removed Azure Cache for Redis resources from Terraform configuration.
- Updated PostgreSQL Flexible Server resource in Terraform.
- Adjusted environment variables in container app configuration to remove Redis references.
- Cleaned up Terraform outputs by removing Redis hostname output.
- Modified pytest configuration to include current directory in Python path.
- Added OpenAI library to requirements for enhanced LLM capabilities.
- Introduced new configuration settings for Azure OpenAI deployment.
- Implemented specialized agents for rules reasoning and custom card design.
- Enhanced MTGOrchestrator to utilize new agents for improved functionality.
- Developed unit tests for custom card agent and rules reasoning agent.
- Established LLM service for structured outputs and graceful fallbacks.
</commit_message>
<xml_diff>
--- a/docs/Solucion_Productiva_MTG_CallCenter.docx
+++ b/docs/Solucion_Productiva_MTG_CallCenter.docx
@@ -43,7 +43,7 @@
         <w:rPr>
           <w:sz w:val="22"/>
         </w:rPr>
-        <w:t>Solución de inteligencia artificial conversacional para soporte a jugadores en el Call Center especializado de Magic: The Gathering (MTG). Diseñado con máxima claridad y pragmatismo: backend FastAPI con herramientas especializadas, RAG sobre reglamento oficial con PostgreSQL + pgvector, integración con magicthegathering.io, propuesta productiva en Azure (Terraform) y observabilidad integral con Application Insights.</w:t>
+        <w:t>Solución de IA conversacional para soporte a jugadores en el Call Center de MTG. Arquitectura Router-Worker: Router determinista central para clasificación rápida (&lt;10ms) y herramientas mecánicas, respaldado por agentes especializados donde aportan valor cognitivo (Rules Reasoning Agent con CoT y Custom Card Designer Agent). Base de datos unificada en PostgreSQL + pgvector (sin Redis), backend FastAPI desacoplado de Streamlit por HTTP, y despliegue en Azure mediante Terraform.</w:t>
       </w:r>
     </w:p>
     <w:p>
@@ -64,7 +64,7 @@
         <w:rPr>
           <w:sz w:val="22"/>
         </w:rPr>
-        <w:t>Caso A (RAG sobre reglamento con citaciones CR), Caso B (Búsqueda estructurada y consumo API MTG con imágenes), Caso C (Memoria multi-turno para refinamiento de búsquedas), Caso Bonus (Diseño de carta custom de Han Solo acorde al Color Pie), No funcionales (código limpio, 100% testeado con pytest, Docker Compose, Terraform validado).</w:t>
+        <w:t>Caso A (RAG sobre reglamento con citaciones CR obligatorias), Caso B (Búsqueda estructurada en API MTG con imágenes oficiales), Caso C (Memoria multi-turno para refinamiento de búsquedas), Caso Bonus (Diseño de carta custom de Han Solo acorde al Color Pie), No funcionales (código limpio, 100% testeado con pytest sin internet, Docker Compose, Terraform validado).</w:t>
       </w:r>
     </w:p>
     <w:p>
@@ -85,7 +85,7 @@
         <w:rPr>
           <w:sz w:val="22"/>
         </w:rPr>
-        <w:t>Un único Intent Router / Orchestrator con 3 herramientas: (1) RAG Store con reglas canónicas y citas formales, (2) Tool de búsqueda en la API de MTG con traducción de términos español-inglés, (3) Conversation Memory que preserva filtros acumulados. Frontend chat interactivo servido en HTML5/JS moderno sin dependencias pesadas.</w:t>
+        <w:t>Streamlit frontend (src/ui/app_streamlit.py) comunicando por HTTP/JSON mediante MTGAssistantClient con FastAPI (/api/chat). El backend utiliza MTGOrchestrator como Router central conectando con el RAG Store de reglas canónicas, la herramienta de API de MTG (con bug max_cmc corregido) y ConversationMemory.</w:t>
       </w:r>
     </w:p>
     <w:p>
@@ -106,7 +106,7 @@
         <w:rPr>
           <w:sz w:val="22"/>
         </w:rPr>
-        <w:t>Servicios: Azure Container Apps (backend serverless auto-escalable), Azure Database for PostgreSQL Flexible Server (pgvector HNSW para vectores, texto completo FTS y sesiones), Azure OpenAI (GPT-4o, GPT-4o-mini, text-embedding-3-large), Azure Application Insights &amp; Log Analytics (trazabilidad distribuida W3C), Azure Key Vault (gestión de secretos).</w:t>
+        <w:t>Servicios: Azure Container Apps (backend serverless auto-escalable), Azure Database for PostgreSQL Flexible Server (pgvector HNSW para vectores, Full-Text Search FTS, sesiones y caché JSONB de cartas sin Redis), Azure OpenAI (GPT-4o, GPT-4o-mini, text-embedding-3-large), Azure Application Insights &amp; Log Analytics (trazabilidad APM), Azure Key Vault (gestión de secretos).</w:t>
       </w:r>
     </w:p>
     <w:p>
@@ -127,7 +127,7 @@
         <w:rPr>
           <w:sz w:val="22"/>
         </w:rPr>
-        <w:t>Ingesta jerárquica por artículos oficiales (CR 100-900), embeddings text-embedding-3-large, índice HNSW (vector_cosine_ops) en pgvector, búsqueda híbrida combinada con Full-Text Search (tsvector en español) y citaciones obligatorias en cada respuesta.</w:t>
+        <w:t>Ingesta jerárquica por artículos oficiales (CR 100-900), embeddings text-embedding-3-large, índice HNSW (vector_cosine_ops) en pgvector, búsqueda híbrida combinada con Full-Text Search (tsvector en español) y citaciones obligatorias (CR XXX.X) en cada respuesta.</w:t>
       </w:r>
     </w:p>
     <w:p>
@@ -148,7 +148,7 @@
         <w:rPr>
           <w:sz w:val="22"/>
         </w:rPr>
-        <w:t>Clasificador de intención determinista de 4 vías: RULES (RAG), CARD_SEARCH (extracción de entidades + llamada HTTP a la API), CUSTOM_CARD (diseño según directrices de Wizards) y CONVERSATION (orientación y ayuda).</w:t>
+        <w:t>Patrón Router-Worker: Router determinista para triage y ejecución directa de herramientas, más dos agentes especializados: (1) Rules &amp; Combat Reasoning Agent para resolver interacciones complejas de combate paso a paso (Chain-of-Thought), y (2) Custom Card Designer Agent para equilibrar estadísticas y costes según el Color Pie.</w:t>
       </w:r>
     </w:p>
     <w:p>
@@ -169,7 +169,7 @@
         <w:rPr>
           <w:sz w:val="22"/>
         </w:rPr>
-        <w:t>Módulo ConversationMemory en src/services/memory.py. Persiste por session_id el historial y el estado last_card_filter, permitiendo repreguntas elípticas como: ¿Y alguna que cueste solo uno? fusionando el contexto previo de color y subtipo.</w:t>
+        <w:t>Módulo ConversationMemory en src/services/memory.py. Persiste por conversation_id el historial y el estado last_card_filter, permitiendo repreguntas elípticas como ¿Y alguna que cueste solo uno? fusionando el contexto previo de color y subtipo a través de la API HTTP.</w:t>
       </w:r>
     </w:p>
     <w:p>
@@ -190,7 +190,7 @@
         <w:rPr>
           <w:sz w:val="22"/>
         </w:rPr>
-        <w:t>Cliente HTTP en src/tools/mtg_api.py consultando https://api.magicthegathering.io/v1/. Incorpora User-Agent personalizado para evitar bloqueos HTTP 403, mapeo de sinónimos en español (guerrero -&gt; Warrior, blanco -&gt; W) y extracción de imágenes oficiales de Gatherer.</w:t>
+        <w:t>Cliente HTTP en src/tools/mtg_api.py consultando https://api.magicthegathering.io/v1/cards. Incorpora User-Agent obligatorio para evitar bloqueos HTTP 403, mapeo canónico (blanco -&gt; W, guerrero -&gt; Warrior) y corrección del bug max_cmc filtrando &lt;= localmente para no excluir cartas de coste 0.</w:t>
       </w:r>
     </w:p>
     <w:p>
@@ -211,7 +211,7 @@
         <w:rPr>
           <w:sz w:val="22"/>
         </w:rPr>
-        <w:t>Trazabilidad distribuida con OpenTelemetry y Application Insights. Monitoreo de latencia (percentiles p50, p95, p99), presupuesto de tokens de entrada/salida para prevenir bucles de costes, evaluación de la Tríada RAG (Faithfulness, Groundedness) y tasa de escalado a jueces humanos L2.</w:t>
+        <w:t>Trazabilidad distribuida con OpenTelemetry y Application Insights. Monitoreo de latencia (p50, p95, p99), presupuesto de tokens de entrada/salida para prevenir bucles de costes, evaluación de la Tríada RAG (Faithfulness, Groundedness) y tasa de escalado a jueces humanos L2.</w:t>
       </w:r>
     </w:p>
     <w:p>
@@ -253,7 +253,7 @@
         <w:rPr>
           <w:sz w:val="22"/>
         </w:rPr>
-        <w:t>Suite completa con 9 tests unitarios y de integración en pytest: test_health_endpoint, test_search_cards_filters, test_search_cards_under_two_mana (requerimiento literal), test_search_cards_api_error (resiliencia), test_rule_retrieval_returns_sources, test_combat_interaction_ninjutsu, test_router_classification, test_chat_preserves_context y test_custom_card_creation. Cobertura del 100% de los requisitos.</w:t>
+        <w:t>Suite unitaria de 17 tests deterministas sin conexión a internet (0.5s de ejecución), probando el contrato API (/api/chat), los 4 flujos, multi-turno HTTP, corrección de max_cmc y memoria. Test de integración separado (-m integration) para validar la API real de MTG.</w:t>
       </w:r>
     </w:p>
     <w:p>
@@ -274,7 +274,7 @@
         <w:rPr>
           <w:sz w:val="22"/>
         </w:rPr>
-        <w:t>Local: Ejecución inmediata con docker compose up -d (Postgres + pgvector) y uvicorn. Producción: Infraestructura como Código (IaC) con Terraform en infra/terraform/ validado exitosamente con terraform validate.</w:t>
+        <w:t>Local: Ejecución con docker compose up -d (PostgreSQL + pgvector) y Streamlit / FastAPI. Producción: Infraestructura como Código (IaC) con Terraform en infra/terraform/ validado exitosamente con terraform validate (sin Redis).</w:t>
       </w:r>
     </w:p>
     <w:p>
@@ -295,7 +295,7 @@
         <w:rPr>
           <w:sz w:val="22"/>
         </w:rPr>
-        <w:t>Autoescalado horizontal en Azure Container Apps (1 a 5 réplicas), índices HNSW para respuesta vectorial en &lt;5ms y capa de caché para evitar consultas redundantes a la API externa.</w:t>
+        <w:t>Autoescalado horizontal en Azure Container Apps (1 a 5 réplicas), índices HNSW para respuesta vectorial en &lt;5ms y tabla de caché en PostgreSQL para evitar consultas redundantes a la API externa.</w:t>
       </w:r>
     </w:p>
     <w:p>
@@ -316,7 +316,7 @@
         <w:rPr>
           <w:sz w:val="22"/>
         </w:rPr>
-        <w:t>Router pragmático frente a 6 agentes para evitar sobreingeniería innecesaria. PostgreSQL + pgvector frente a Azure AI Search para unificar vectores, texto y relacional a una fracción del coste ( vs /mes). UI web ligera frente a framework pesado de React.</w:t>
+        <w:t>Router determinista central con agentes especializados únicamente donde aportan valor cognitivo (evitando la sobreingeniería de 6 agentes innecesarios). PostgreSQL + pgvector como motor unificado (reemplazando Azure AI Search, Cosmos DB y Redis a una fracción del coste:  vs /mes). Frontend Streamlit desacoplado por HTTP de FastAPI.</w:t>
       </w:r>
     </w:p>
     <w:p>

</xml_diff>